<commit_message>
Rename figures: fig1_context_by_variant through fig6_robustness_analysis
</commit_message>
<xml_diff>
--- a/paper/main.docx
+++ b/paper/main.docx
@@ -8622,6 +8622,11 @@
       </w:r>
     </w:p>
     <w:p>
+      <w:r>
+        <w:br w:type="page"/>
+      </w:r>
+    </w:p>
+    <w:p>
       <w:pPr>
         <w:pStyle w:val="Heading1"/>
       </w:pPr>
@@ -8645,7 +8650,7 @@
               <a:graphicData uri="http://schemas.openxmlformats.org/drawingml/2006/picture">
                 <pic:pic>
                   <pic:nvPicPr>
-                    <pic:cNvPr id="0" name="context_distribution.png"/>
+                    <pic:cNvPr id="0" name="image.png"/>
                     <pic:cNvPicPr/>
                   </pic:nvPicPr>
                   <pic:blipFill>
@@ -8677,7 +8682,7 @@
           <w:i/>
           <w:sz w:val="18"/>
         </w:rPr>
-        <w:t>Figure 1: Context distribution by spelling variant across all 55 pairs (n=29,938). Russian forms dominate historical contexts (-5.3pp), Ukrainian forms dominate academic (+5.9pp) and sports (+3.3pp).</w:t>
+        <w:t>Figure 1: Context distribution by spelling variant across all 55 pairs (n=29,938).</w:t>
       </w:r>
     </w:p>
     <w:p/>
@@ -8697,7 +8702,7 @@
               <a:graphicData uri="http://schemas.openxmlformats.org/drawingml/2006/picture">
                 <pic:pic>
                   <pic:nvPicPr>
-                    <pic:cNvPr id="0" name="six_mechanisms.png"/>
+                    <pic:cNvPr id="0" name="image.png"/>
                     <pic:cNvPicPr/>
                   </pic:nvPicPr>
                   <pic:blipFill>
@@ -8729,7 +8734,7 @@
           <w:i/>
           <w:sz w:val="18"/>
         </w:rPr>
-        <w:t>Figure 2: Six mechanisms of toponym adoption. Adoption ranges from 4.8% (citation inertia) to 89.6% (naming as resistance), each driven by a distinct sociolinguistic mechanism.</w:t>
+        <w:t>Figure 2: Six mechanisms of toponym adoption, ranging from 4.8% to 89.6%.</w:t>
       </w:r>
     </w:p>
     <w:p/>
@@ -8749,7 +8754,7 @@
               <a:graphicData uri="http://schemas.openxmlformats.org/drawingml/2006/picture">
                 <pic:pic>
                   <pic:nvPicPr>
-                    <pic:cNvPr id="0" name="collocations_chernobyl.png"/>
+                    <pic:cNvPr id="0" name="image.png"/>
                     <pic:cNvPicPr/>
                   </pic:nvPicPr>
                   <pic:blipFill>
@@ -8781,7 +8786,7 @@
           <w:i/>
           <w:sz w:val="18"/>
         </w:rPr>
-        <w:t>Figure 3: Collocations for Chernobyl vs Chornobyl. The Russian form co-occurs with entertainment (hbo, fukushima) while the Ukrainian form co-occurs with nuclear operations (cleanup, exclusion).</w:t>
+        <w:t>Figure 3: Collocations — Chernobyl (entertainment) vs Chornobyl (nuclear operations).</w:t>
       </w:r>
     </w:p>
     <w:p/>
@@ -8801,7 +8806,7 @@
               <a:graphicData uri="http://schemas.openxmlformats.org/drawingml/2006/picture">
                 <pic:pic>
                   <pic:nvPicPr>
-                    <pic:cNvPr id="0" name="sentiment.png"/>
+                    <pic:cNvPr id="0" name="image.png"/>
                     <pic:cNvPicPr/>
                   </pic:nvPicPr>
                   <pic:blipFill>
@@ -8833,7 +8838,7 @@
           <w:i/>
           <w:sz w:val="18"/>
         </w:rPr>
-        <w:t>Figure 4: Sentiment by variant and context. War reporting is negative regardless of variant, but Ukrainian-form war texts are slightly less negative (resilience framing). Food is positive regardless.</w:t>
+        <w:t>Figure 4: Sentiment by variant and context.</w:t>
       </w:r>
     </w:p>
     <w:p/>
@@ -8853,7 +8858,7 @@
               <a:graphicData uri="http://schemas.openxmlformats.org/drawingml/2006/picture">
                 <pic:pic>
                   <pic:nvPicPr>
-                    <pic:cNvPr id="0" name="benchmark.png"/>
+                    <pic:cNvPr id="0" name="image.png"/>
                     <pic:cNvPicPr/>
                   </pic:nvPicPr>
                   <pic:blipFill>
@@ -8885,7 +8890,7 @@
           <w:i/>
           <w:sz w:val="18"/>
         </w:rPr>
-        <w:t>Figure 5: Encoder benchmark on 10-class context classification. DeBERTa-v3-large achieves F1=88.8%, confirming LLM labels are learnable across architectures.</w:t>
+        <w:t>Figure 5: Encoder benchmark — DeBERTa-v3-large F1=88.8%.</w:t>
       </w:r>
     </w:p>
     <w:p/>
@@ -8905,7 +8910,7 @@
               <a:graphicData uri="http://schemas.openxmlformats.org/drawingml/2006/picture">
                 <pic:pic>
                   <pic:nvPicPr>
-                    <pic:cNvPr id="0" name="robustness.png"/>
+                    <pic:cNvPr id="0" name="image.png"/>
                     <pic:cNvPicPr/>
                   </pic:nvPicPr>
                   <pic:blipFill>
@@ -8937,7 +8942,7 @@
           <w:i/>
           <w:sz w:val="18"/>
         </w:rPr>
-        <w:t>Figure 6: Robustness analysis. Seed stability σ=0.34pp, LR=1e-5 optimal, 3 epochs optimal (5 and 7 overfit). Results are not hyperparameter-dependent.</w:t>
+        <w:t>Figure 6: Robustness — seed σ=0.34pp, LR=1e-5 optimal, 3 epochs optimal.</w:t>
       </w:r>
     </w:p>
     <w:p/>

</xml_diff>